<commit_message>
otro avance mas hasta jacobiano
</commit_message>
<xml_diff>
--- a/Trabajo_Final/Trabajo Final R1-BORQUEZ-RAYES.docx
+++ b/Trabajo_Final/Trabajo Final R1-BORQUEZ-RAYES.docx
@@ -224,6 +224,14 @@
           <w:szCs w:val="36"/>
           <w:lang w:val="es-ES"/>
         </w:rPr>
+        <w:t xml:space="preserve">la </w:t>
+      </w:r>
+      <w:r>
+        <w:rPr>
+          <w:sz w:val="36"/>
+          <w:szCs w:val="36"/>
+          <w:lang w:val="es-ES"/>
+        </w:rPr>
         <w:t>manipulación de Pastillas Radioactivas</w:t>
       </w:r>
     </w:p>
@@ -2645,21 +2653,7 @@
         <w:rPr>
           <w:lang w:val="es-ES"/>
         </w:rPr>
-        <w:t xml:space="preserve">El estudio se enfoca inicialmente en definir la aplicación y el diseño de la celda robótica. Se utiliza la convención de </w:t>
-      </w:r>
-      <w:proofErr w:type="spellStart"/>
-      <w:r>
-        <w:rPr>
-          <w:lang w:val="es-ES"/>
-        </w:rPr>
-        <w:t>Denavit-Hartenberg</w:t>
-      </w:r>
-      <w:proofErr w:type="spellEnd"/>
-      <w:r>
-        <w:rPr>
-          <w:lang w:val="es-ES"/>
-        </w:rPr>
-        <w:t xml:space="preserve"> para modelar el rob</w:t>
+        <w:t>El estudio se enfoca inicialmente en definir la aplicación y el diseño de la celda robótica. Se utiliza la convención de Denavit-Hartenberg para modelar el rob</w:t>
       </w:r>
       <w:r>
         <w:rPr>
@@ -2756,27 +2750,13 @@
         <w:rPr>
           <w:lang w:val="es-ES"/>
         </w:rPr>
-        <w:t xml:space="preserve">ón del </w:t>
-      </w:r>
-      <w:proofErr w:type="spellStart"/>
-      <w:r>
-        <w:rPr>
-          <w:lang w:val="es-ES"/>
-        </w:rPr>
-        <w:t>L</w:t>
-      </w:r>
-      <w:r>
-        <w:rPr>
-          <w:lang w:val="es-ES"/>
-        </w:rPr>
-        <w:t>ayout</w:t>
-      </w:r>
-      <w:proofErr w:type="spellEnd"/>
-      <w:r>
-        <w:rPr>
-          <w:lang w:val="es-ES"/>
-        </w:rPr>
-        <w:t xml:space="preserve"> de la celda</w:t>
+        <w:t>ón del L</w:t>
+      </w:r>
+      <w:r>
+        <w:rPr>
+          <w:lang w:val="es-ES"/>
+        </w:rPr>
+        <w:t>ayout de la celda</w:t>
       </w:r>
     </w:p>
     <w:p>
@@ -2847,41 +2827,13 @@
         <w:rPr>
           <w:lang w:val="es-ES"/>
         </w:rPr>
-        <w:t xml:space="preserve">En </w:t>
-      </w:r>
-      <w:proofErr w:type="spellStart"/>
-      <w:r>
-        <w:rPr>
-          <w:lang w:val="es-ES"/>
-        </w:rPr>
-        <w:t>el</w:t>
-      </w:r>
-      <w:proofErr w:type="spellEnd"/>
-      <w:r>
-        <w:rPr>
-          <w:lang w:val="es-ES"/>
-        </w:rPr>
-        <w:t xml:space="preserve"> [Anexo] se muestran los</w:t>
-      </w:r>
-      <w:r>
-        <w:rPr>
-          <w:lang w:val="es-ES"/>
-        </w:rPr>
-        <w:t xml:space="preserve"> planos con el detalle del </w:t>
-      </w:r>
-      <w:proofErr w:type="spellStart"/>
-      <w:r>
-        <w:rPr>
-          <w:lang w:val="es-ES"/>
-        </w:rPr>
-        <w:t>layout</w:t>
-      </w:r>
-      <w:proofErr w:type="spellEnd"/>
-      <w:r>
-        <w:rPr>
-          <w:lang w:val="es-ES"/>
-        </w:rPr>
-        <w:t xml:space="preserve"> de la planta.</w:t>
+        <w:t>En el [Anexo] se muestran los</w:t>
+      </w:r>
+      <w:r>
+        <w:rPr>
+          <w:lang w:val="es-ES"/>
+        </w:rPr>
+        <w:t xml:space="preserve"> planos con el detalle del layout de la planta.</w:t>
       </w:r>
     </w:p>
     <w:p>
@@ -2929,20 +2881,20 @@
         <w:rPr>
           <w:lang w:val="es-ES"/>
         </w:rPr>
-        <w:t xml:space="preserve">átiles y en la Fig. 3 el modelo 3D simplificado que se elaboró para representarla. Se </w:t>
+        <w:t>átiles y en la Fig. 3 el modelo 3D simplificado que se elaboró para representarla. Se considera en este caso que la cámara tiene un alojamiento con tapa a rosca</w:t>
+      </w:r>
+      <w:r>
+        <w:rPr>
+          <w:lang w:val="es-ES"/>
+        </w:rPr>
+        <w:t xml:space="preserve"> con un giro de </w:t>
       </w:r>
       <w:r>
         <w:rPr>
           <w:lang w:val="es-ES"/>
         </w:rPr>
         <w:lastRenderedPageBreak/>
-        <w:t>considera en este caso que la cámara tiene un alojamiento con tapa a rosca</w:t>
-      </w:r>
-      <w:r>
-        <w:rPr>
-          <w:lang w:val="es-ES"/>
-        </w:rPr>
-        <w:t xml:space="preserve"> con un giro de 360° horario para cerrar y horario para cerrar. En el [Anexo] se muestra el plano con el detalle.</w:t>
+        <w:t>360° horario para cerrar y horario para cerrar. En el [Anexo] se muestra el plano con el detalle.</w:t>
       </w:r>
     </w:p>
     <w:p>
@@ -3207,21 +3159,7 @@
         <w:rPr>
           <w:lang w:val="es-ES"/>
         </w:rPr>
-        <w:t xml:space="preserve"> y en </w:t>
-      </w:r>
-      <w:proofErr w:type="spellStart"/>
-      <w:r>
-        <w:rPr>
-          <w:lang w:val="es-ES"/>
-        </w:rPr>
-        <w:t>el</w:t>
-      </w:r>
-      <w:proofErr w:type="spellEnd"/>
-      <w:r>
-        <w:rPr>
-          <w:lang w:val="es-ES"/>
-        </w:rPr>
-        <w:t xml:space="preserve"> </w:t>
+        <w:t xml:space="preserve"> y en el </w:t>
       </w:r>
       <w:r>
         <w:rPr>
@@ -3433,32 +3371,26 @@
         <w:rPr>
           <w:lang w:val="es-ES"/>
         </w:rPr>
-        <w:t xml:space="preserve">El UR10e es un robot colaborativo versátil, diseñado para tareas de automatización y con capacidad de carga media. Es ideal para aplicaciones de manipulación, ensamblaje, carga y </w:t>
-      </w:r>
+        <w:t>El UR10e es un robot colaborativo versátil, diseñado para tareas de automatización y con capacidad de carga media. Es ideal para aplicaciones de manipulación, ensamblaje, carga y descarga, en entornos que requieren precisión y seguridad. Destaca por su facilidad de programación y montaje, lo que facilita su inte</w:t>
+      </w:r>
+      <w:r>
+        <w:rPr>
+          <w:lang w:val="es-ES"/>
+        </w:rPr>
+        <w:t>gración en diversas industrias.</w:t>
+      </w:r>
+    </w:p>
+    <w:p>
+      <w:pPr>
+        <w:rPr>
+          <w:lang w:val="es-ES"/>
+        </w:rPr>
+      </w:pPr>
       <w:r>
         <w:rPr>
           <w:lang w:val="es-ES"/>
         </w:rPr>
         <w:lastRenderedPageBreak/>
-        <w:t>descarga, en entornos que requieren precisión y seguridad. Destaca por su facilidad de programación y montaje, lo que facilita su inte</w:t>
-      </w:r>
-      <w:r>
-        <w:rPr>
-          <w:lang w:val="es-ES"/>
-        </w:rPr>
-        <w:t>gración en diversas industrias.</w:t>
-      </w:r>
-    </w:p>
-    <w:p>
-      <w:pPr>
-        <w:rPr>
-          <w:lang w:val="es-ES"/>
-        </w:rPr>
-      </w:pPr>
-      <w:r>
-        <w:rPr>
-          <w:lang w:val="es-ES"/>
-        </w:rPr>
         <w:t>En este informe se destacan las características más relevantes para el análisis de la cinemática, determinadas a partir de la hoja de datos [referencia]. Es un robot tipo serie con 6 grados de libertad rotacionales y límites articulares de ±360° en todas sus articulaciones. En la Fig. 7 se muestra el robot, y en la Fig. 8,</w:t>
       </w:r>
       <w:r>
@@ -3492,21 +3424,7 @@
         <w:rPr>
           <w:lang w:val="es-ES"/>
         </w:rPr>
-        <w:t xml:space="preserve">Con un alcance máximo de 1300 mm y carga máxima de 12.5 kg, el UR10e es adecuado para esta aplicación. Su capacidad de torque en el extremo final es de alrededor de 10 </w:t>
-      </w:r>
-      <w:proofErr w:type="spellStart"/>
-      <w:r>
-        <w:rPr>
-          <w:lang w:val="es-ES"/>
-        </w:rPr>
-        <w:t>Nm</w:t>
-      </w:r>
-      <w:proofErr w:type="spellEnd"/>
-      <w:r>
-        <w:rPr>
-          <w:lang w:val="es-ES"/>
-        </w:rPr>
-        <w:t>, suficiente para la operación, considerando que el torque promedio para abrir roscas ronda dicho valor.</w:t>
+        <w:t>Con un alcance máximo de 1300 mm y carga máxima de 12.5 kg, el UR10e es adecuado para esta aplicación. Su capacidad de torque en el extremo final es de alrededor de 10 Nm, suficiente para la operación, considerando que el torque promedio para abrir roscas ronda dicho valor.</w:t>
       </w:r>
     </w:p>
     <w:p>
@@ -3584,19 +3502,8 @@
           <w:u w:val="none"/>
           <w:lang w:val="es-AR"/>
         </w:rPr>
-        <w:t xml:space="preserve"> </w:t>
-      </w:r>
-      <w:proofErr w:type="spellStart"/>
-      <w:r>
-        <w:rPr>
-          <w:rFonts w:eastAsiaTheme="minorHAnsi" w:cstheme="minorBidi"/>
-          <w:szCs w:val="22"/>
-          <w:u w:val="none"/>
-          <w:lang w:val="es-AR"/>
-        </w:rPr>
-        <w:t>gripper</w:t>
-      </w:r>
-      <w:proofErr w:type="spellEnd"/>
+        <w:t xml:space="preserve"> gripper</w:t>
+      </w:r>
       <w:r>
         <w:rPr>
           <w:rFonts w:eastAsiaTheme="minorHAnsi" w:cstheme="minorBidi"/>
@@ -3695,35 +3602,7 @@
         <w:rPr>
           <w:lang w:val="es-AR"/>
         </w:rPr>
-        <w:t xml:space="preserve">En concreto se considera la utilización del </w:t>
-      </w:r>
-      <w:proofErr w:type="spellStart"/>
-      <w:r>
-        <w:rPr>
-          <w:lang w:val="es-AR"/>
-        </w:rPr>
-        <w:t>gripper</w:t>
-      </w:r>
-      <w:proofErr w:type="spellEnd"/>
-      <w:r>
-        <w:rPr>
-          <w:lang w:val="es-AR"/>
-        </w:rPr>
-        <w:t xml:space="preserve"> de 3 dedos de </w:t>
-      </w:r>
-      <w:proofErr w:type="spellStart"/>
-      <w:r>
-        <w:rPr>
-          <w:lang w:val="es-AR"/>
-        </w:rPr>
-        <w:t>RobotiQ</w:t>
-      </w:r>
-      <w:proofErr w:type="spellEnd"/>
-      <w:r>
-        <w:rPr>
-          <w:lang w:val="es-AR"/>
-        </w:rPr>
-        <w:t xml:space="preserve"> que se muestra en la Fig. 9 [Anexo].</w:t>
+        <w:t>En concreto se considera la utilización del gripper de 3 dedos de RobotiQ que se muestra en la Fig. 9 [Anexo].</w:t>
       </w:r>
     </w:p>
     <w:p>
@@ -3859,7 +3738,6 @@
         <w:rPr>
           <w:lang w:val="es-ES"/>
         </w:rPr>
-        <w:lastRenderedPageBreak/>
         <w:t>4.</w:t>
       </w:r>
       <w:r>
@@ -3868,14 +3746,12 @@
         </w:rPr>
         <w:tab/>
       </w:r>
-      <w:proofErr w:type="spellStart"/>
       <w:r>
         <w:rPr>
           <w:lang w:val="es-ES"/>
         </w:rPr>
         <w:t>Denavit-Hartenberg</w:t>
       </w:r>
-      <w:proofErr w:type="spellEnd"/>
     </w:p>
     <w:p>
       <w:pPr>
@@ -3897,29 +3773,7 @@
           <w:szCs w:val="22"/>
           <w:lang w:val="es-ES"/>
         </w:rPr>
-        <w:t xml:space="preserve">Uno de los primeros pasos en el estudio de la cinemática del robot es la definición de los parámetros que representan su cadena cinemática. Esto permitirá luego establecer las transformaciones entre los marcos de referencia de las articulaciones, la base y el efector final para distintas configuraciones articulares. Aunque existen diversas maneras de definir estas transformaciones, es común adoptar una convención específica que determine los parámetros considerados y su significado. En este trabajo, se adopta la convención de </w:t>
-      </w:r>
-      <w:proofErr w:type="spellStart"/>
-      <w:r>
-        <w:rPr>
-          <w:rFonts w:eastAsiaTheme="minorHAnsi" w:cstheme="minorBidi"/>
-          <w:b w:val="0"/>
-          <w:sz w:val="24"/>
-          <w:szCs w:val="22"/>
-          <w:lang w:val="es-ES"/>
-        </w:rPr>
-        <w:t>Denavit-Hartenberg</w:t>
-      </w:r>
-      <w:proofErr w:type="spellEnd"/>
-      <w:r>
-        <w:rPr>
-          <w:rFonts w:eastAsiaTheme="minorHAnsi" w:cstheme="minorBidi"/>
-          <w:b w:val="0"/>
-          <w:sz w:val="24"/>
-          <w:szCs w:val="22"/>
-          <w:lang w:val="es-ES"/>
-        </w:rPr>
-        <w:t>, cuya aplicación se detalla a continuación.</w:t>
+        <w:t>Uno de los primeros pasos en el estudio de la cinemática del robot es la definición de los parámetros que representan su cadena cinemática. Esto permitirá luego establecer las transformaciones entre los marcos de referencia de las articulaciones, la base y el efector final para distintas configuraciones articulares. Aunque existen diversas maneras de definir estas transformaciones, es común adoptar una convención específica que determine los parámetros considerados y su significado. En este trabajo, se adopta la convención de Denavit-Hartenberg, cuya aplicación se detalla a continuación.</w:t>
       </w:r>
     </w:p>
     <w:p>
@@ -3979,6 +3833,7 @@
         <w:rPr>
           <w:lang w:val="es-ES"/>
         </w:rPr>
+        <w:lastRenderedPageBreak/>
         <w:t>Fig. 12</w:t>
       </w:r>
     </w:p>
@@ -4078,16 +3933,8 @@
           <w:lang w:val="es-ES"/>
         </w:rPr>
         <w:tab/>
-        <w:t xml:space="preserve">Matriz de </w:t>
-      </w:r>
-      <w:proofErr w:type="spellStart"/>
-      <w:r>
-        <w:rPr>
-          <w:lang w:val="es-ES"/>
-        </w:rPr>
-        <w:t>Denavit-Hartenberg</w:t>
-      </w:r>
-      <w:proofErr w:type="spellEnd"/>
+        <w:t>Matriz de Denavit-Hartenberg</w:t>
+      </w:r>
     </w:p>
     <w:p>
       <w:pPr>
@@ -5430,21 +5277,7 @@
           <w:lang w:val="es-ES"/>
         </w:rPr>
         <w:tab/>
-        <w:t xml:space="preserve">Tabla 1: Parámetros de </w:t>
-      </w:r>
-      <w:proofErr w:type="spellStart"/>
-      <w:r>
-        <w:rPr>
-          <w:lang w:val="es-ES"/>
-        </w:rPr>
-        <w:t>Denavit-Hartenberg</w:t>
-      </w:r>
-      <w:proofErr w:type="spellEnd"/>
-      <w:r>
-        <w:rPr>
-          <w:lang w:val="es-ES"/>
-        </w:rPr>
-        <w:t xml:space="preserve"> del Robot,</w:t>
+        <w:t>Tabla 1: Parámetros de Denavit-Hartenberg del Robot,</w:t>
       </w:r>
     </w:p>
     <w:p>
@@ -5458,7 +5291,6 @@
         <w:rPr>
           <w:lang w:val="es-ES"/>
         </w:rPr>
-        <w:lastRenderedPageBreak/>
         <w:t>4.4</w:t>
       </w:r>
       <w:r>
@@ -5506,13 +5338,13 @@
           <w:tab w:val="left" w:pos="8647"/>
         </w:tabs>
         <w:rPr>
-          <w:lang w:val="en-GB"/>
+          <w:lang w:val="es-AR"/>
         </w:rPr>
       </w:pPr>
       <w:r>
         <w:rPr>
           <w:rFonts w:eastAsiaTheme="minorEastAsia"/>
-          <w:lang w:val="en-GB"/>
+          <w:lang w:val="es-AR"/>
         </w:rPr>
         <w:tab/>
       </w:r>
@@ -5521,7 +5353,13 @@
           <w:rPr>
             <w:lang w:val="en-GB"/>
           </w:rPr>
-          <m:t xml:space="preserve">offset = </m:t>
+          <m:t>offset</m:t>
+        </m:r>
+        <m:r>
+          <w:rPr>
+            <w:lang w:val="es-AR"/>
+          </w:rPr>
+          <m:t xml:space="preserve"> = </m:t>
         </m:r>
         <m:d>
           <m:dPr>
@@ -5555,7 +5393,7 @@
               <m:den>
                 <m:r>
                   <w:rPr>
-                    <w:lang w:val="en-GB"/>
+                    <w:lang w:val="es-AR"/>
                   </w:rPr>
                   <m:t>2</m:t>
                 </m:r>
@@ -5563,7 +5401,7 @@
             </m:f>
             <m:r>
               <w:rPr>
-                <w:lang w:val="en-GB"/>
+                <w:lang w:val="es-AR"/>
               </w:rPr>
               <m:t xml:space="preserve">  </m:t>
             </m:r>
@@ -5587,7 +5425,7 @@
               <m:den>
                 <m:r>
                   <w:rPr>
-                    <w:lang w:val="en-GB"/>
+                    <w:lang w:val="es-AR"/>
                   </w:rPr>
                   <m:t>2</m:t>
                 </m:r>
@@ -5595,21 +5433,9 @@
             </m:f>
             <m:r>
               <w:rPr>
-                <w:lang w:val="en-GB"/>
-              </w:rPr>
-              <m:t xml:space="preserve">  </m:t>
-            </m:r>
-            <m:r>
-              <w:rPr>
-                <w:lang w:val="en-GB"/>
-              </w:rPr>
-              <m:t xml:space="preserve">0 </m:t>
-            </m:r>
-            <m:r>
-              <w:rPr>
-                <w:lang w:val="en-GB"/>
-              </w:rPr>
-              <m:t xml:space="preserve"> </m:t>
+                <w:lang w:val="es-AR"/>
+              </w:rPr>
+              <m:t xml:space="preserve">  0  </m:t>
             </m:r>
             <m:f>
               <m:fPr>
@@ -5631,7 +5457,7 @@
               <m:den>
                 <m:r>
                   <w:rPr>
-                    <w:lang w:val="en-GB"/>
+                    <w:lang w:val="es-AR"/>
                   </w:rPr>
                   <m:t>2</m:t>
                 </m:r>
@@ -5639,27 +5465,21 @@
             </m:f>
             <m:r>
               <w:rPr>
-                <w:lang w:val="en-GB"/>
-              </w:rPr>
-              <m:t xml:space="preserve"> </m:t>
+                <w:lang w:val="es-AR"/>
+              </w:rPr>
+              <m:t xml:space="preserve">  -</m:t>
             </m:r>
             <m:r>
               <w:rPr>
                 <w:lang w:val="en-GB"/>
               </w:rPr>
-              <m:t xml:space="preserve"> </m:t>
+              <m:t>π</m:t>
             </m:r>
             <m:r>
               <w:rPr>
-                <w:lang w:val="en-GB"/>
-              </w:rPr>
-              <m:t>-</m:t>
-            </m:r>
-            <m:r>
-              <w:rPr>
-                <w:lang w:val="en-GB"/>
-              </w:rPr>
-              <m:t>π  0</m:t>
+                <w:lang w:val="es-AR"/>
+              </w:rPr>
+              <m:t xml:space="preserve">  0</m:t>
             </m:r>
           </m:e>
         </m:d>
@@ -5667,7 +5487,7 @@
       <w:r>
         <w:rPr>
           <w:rFonts w:eastAsiaTheme="minorEastAsia"/>
-          <w:lang w:val="en-GB"/>
+          <w:lang w:val="es-AR"/>
         </w:rPr>
         <w:tab/>
         <w:t>(1)</w:t>
@@ -5759,28 +5579,47 @@
       <w:pPr>
         <w:jc w:val="center"/>
         <w:rPr>
+          <w:lang w:val="es-AR"/>
+        </w:rPr>
+      </w:pPr>
+      <w:r>
+        <w:rPr>
+          <w:lang w:val="es-AR"/>
+        </w:rPr>
+        <w:t>Fig.15</w:t>
+      </w:r>
+    </w:p>
+    <w:p>
+      <w:pPr>
+        <w:rPr>
+          <w:lang w:val="es-AR"/>
+        </w:rPr>
+      </w:pPr>
+      <w:r>
+        <w:rPr>
+          <w:lang w:val="es-AR"/>
+        </w:rPr>
+        <w:lastRenderedPageBreak/>
+        <w:t>Los límites de</w:t>
+      </w:r>
+    </w:p>
+    <w:p>
+      <w:pPr>
+        <w:tabs>
+          <w:tab w:val="center" w:pos="4678"/>
+          <w:tab w:val="left" w:pos="8505"/>
+        </w:tabs>
+        <w:rPr>
+          <w:rFonts w:eastAsiaTheme="minorEastAsia"/>
           <w:lang w:val="en-GB"/>
         </w:rPr>
       </w:pPr>
       <w:r>
         <w:rPr>
+          <w:rFonts w:eastAsiaTheme="minorEastAsia"/>
           <w:lang w:val="en-GB"/>
         </w:rPr>
-        <w:t>Fig.15</w:t>
-      </w:r>
-    </w:p>
-    <w:p>
-      <w:pPr>
-        <w:rPr>
-          <w:rFonts w:eastAsiaTheme="minorEastAsia"/>
-          <w:lang w:val="es-AR"/>
-        </w:rPr>
-      </w:pPr>
-      <w:r>
-        <w:rPr>
-          <w:lang w:val="es-AR"/>
-        </w:rPr>
-        <w:t xml:space="preserve">Los límites de </w:t>
+        <w:tab/>
       </w:r>
       <m:oMath>
         <m:sSub>
@@ -5811,7 +5650,7 @@
         </m:sSub>
         <m:r>
           <w:rPr>
-            <w:lang w:val="es-AR"/>
+            <w:lang w:val="en-GB"/>
           </w:rPr>
           <m:t xml:space="preserve"> =</m:t>
         </m:r>
@@ -5843,7 +5682,7 @@
         </m:sSub>
         <m:r>
           <w:rPr>
-            <w:lang w:val="es-AR"/>
+            <w:lang w:val="en-GB"/>
           </w:rPr>
           <m:t>+</m:t>
         </m:r>
@@ -5883,9 +5722,38 @@
       <w:r>
         <w:rPr>
           <w:rFonts w:eastAsiaTheme="minorEastAsia"/>
+          <w:lang w:val="en-GB"/>
+        </w:rPr>
+        <w:tab/>
+      </w:r>
+      <w:r>
+        <w:rPr>
+          <w:rFonts w:eastAsiaTheme="minorEastAsia"/>
+          <w:lang w:val="en-GB"/>
+        </w:rPr>
+        <w:t>(2)</w:t>
+      </w:r>
+    </w:p>
+    <w:p>
+      <w:pPr>
+        <w:rPr>
+          <w:rFonts w:eastAsiaTheme="minorEastAsia"/>
           <w:lang w:val="es-AR"/>
         </w:rPr>
-        <w:t xml:space="preserve"> son de </w:t>
+      </w:pPr>
+      <w:r>
+        <w:rPr>
+          <w:rFonts w:eastAsiaTheme="minorEastAsia"/>
+          <w:lang w:val="es-AR"/>
+        </w:rPr>
+        <w:t>S</w:t>
+      </w:r>
+      <w:r>
+        <w:rPr>
+          <w:rFonts w:eastAsiaTheme="minorEastAsia"/>
+          <w:lang w:val="es-AR"/>
+        </w:rPr>
+        <w:t xml:space="preserve">on de </w:t>
       </w:r>
       <m:oMath>
         <m:r>
@@ -5917,17 +5785,8 @@
           <w:rFonts w:eastAsiaTheme="minorEastAsia"/>
           <w:lang w:val="es-AR"/>
         </w:rPr>
-        <w:t xml:space="preserve">4.5 Matriz de Base y </w:t>
-      </w:r>
-      <w:proofErr w:type="spellStart"/>
-      <w:r>
-        <w:rPr>
-          <w:rFonts w:eastAsiaTheme="minorEastAsia"/>
-          <w:lang w:val="es-AR"/>
-        </w:rPr>
-        <w:t>Tool</w:t>
-      </w:r>
-      <w:proofErr w:type="spellEnd"/>
+        <w:t>4.5 Matriz de Base y Tool</w:t>
+      </w:r>
     </w:p>
     <w:p>
       <w:pPr>
@@ -6346,7 +6205,14 @@
           <w:lang w:val="es-AR"/>
         </w:rPr>
         <w:tab/>
-        <w:t>(2)</w:t>
+        <w:t>(3</w:t>
+      </w:r>
+      <w:r>
+        <w:rPr>
+          <w:rFonts w:eastAsiaTheme="minorEastAsia"/>
+          <w:lang w:val="es-AR"/>
+        </w:rPr>
+        <w:t>)</w:t>
       </w:r>
     </w:p>
     <w:p>
@@ -6509,9 +6375,8 @@
           <w:szCs w:val="22"/>
           <w:lang w:val="es-AR"/>
         </w:rPr>
-        <w:t xml:space="preserve"> “</w:t>
-      </w:r>
-      <w:proofErr w:type="spellStart"/>
+        <w:t xml:space="preserve"> “Tool Center Point”</w:t>
+      </w:r>
       <w:r>
         <w:rPr>
           <w:rFonts w:eastAsiaTheme="minorHAnsi" w:cstheme="minorBidi"/>
@@ -6520,9 +6385,8 @@
           <w:szCs w:val="22"/>
           <w:lang w:val="es-AR"/>
         </w:rPr>
-        <w:t>Tool</w:t>
-      </w:r>
-      <w:proofErr w:type="spellEnd"/>
+        <w:t xml:space="preserve"> a lo largo del eje Z de la brida</w:t>
+      </w:r>
       <w:r>
         <w:rPr>
           <w:rFonts w:eastAsiaTheme="minorHAnsi" w:cstheme="minorBidi"/>
@@ -6531,40 +6395,8 @@
           <w:szCs w:val="22"/>
           <w:lang w:val="es-AR"/>
         </w:rPr>
-        <w:t xml:space="preserve"> Center Point”</w:t>
-      </w:r>
-      <w:r>
-        <w:rPr>
-          <w:rFonts w:eastAsiaTheme="minorHAnsi" w:cstheme="minorBidi"/>
-          <w:b w:val="0"/>
-          <w:sz w:val="24"/>
-          <w:szCs w:val="22"/>
-          <w:lang w:val="es-AR"/>
-        </w:rPr>
-        <w:t xml:space="preserve"> a lo largo del eje Z de la brida</w:t>
-      </w:r>
-      <w:r>
-        <w:rPr>
-          <w:rFonts w:eastAsiaTheme="minorHAnsi" w:cstheme="minorBidi"/>
-          <w:b w:val="0"/>
-          <w:sz w:val="24"/>
-          <w:szCs w:val="22"/>
-          <w:lang w:val="es-AR"/>
-        </w:rPr>
-        <w:t xml:space="preserve"> hasta ¾ de la extensión máxima del </w:t>
-      </w:r>
-      <w:proofErr w:type="spellStart"/>
-      <w:r>
-        <w:rPr>
-          <w:rFonts w:eastAsiaTheme="minorHAnsi" w:cstheme="minorBidi"/>
-          <w:b w:val="0"/>
-          <w:sz w:val="24"/>
-          <w:szCs w:val="22"/>
-          <w:lang w:val="es-AR"/>
-        </w:rPr>
-        <w:t>gripper</w:t>
-      </w:r>
-      <w:proofErr w:type="spellEnd"/>
+        <w:t xml:space="preserve"> hasta ¾ de la extensión máxima del gripper</w:t>
+      </w:r>
       <w:r>
         <w:rPr>
           <w:rFonts w:eastAsiaTheme="minorHAnsi" w:cstheme="minorBidi"/>
@@ -6933,7 +6765,14 @@
           <w:lang w:val="es-AR"/>
         </w:rPr>
         <w:tab/>
-        <w:t>(3)</w:t>
+        <w:t>(4</w:t>
+      </w:r>
+      <w:r>
+        <w:rPr>
+          <w:rFonts w:eastAsiaTheme="minorEastAsia"/>
+          <w:lang w:val="es-AR"/>
+        </w:rPr>
+        <w:t>)</w:t>
       </w:r>
     </w:p>
     <w:p>
@@ -7013,12 +6852,6 @@
         <w:tab/>
       </w:r>
       <m:oMath>
-        <m:r>
-          <w:rPr>
-            <w:lang w:val="es-ES"/>
-          </w:rPr>
-          <w:tab/>
-        </m:r>
         <m:d>
           <m:dPr>
             <m:ctrlPr>
@@ -7116,105 +6949,27 @@
           <w:lang w:val="es-ES"/>
         </w:rPr>
         <w:tab/>
-        <w:t>(4)</w:t>
-      </w:r>
-    </w:p>
-    <w:p>
-      <w:pPr>
-        <w:rPr>
-          <w:lang w:val="es-ES"/>
-        </w:rPr>
-      </w:pPr>
-      <w:r>
-        <w:rPr>
-          <w:lang w:val="es-ES"/>
-        </w:rPr>
-        <w:lastRenderedPageBreak/>
-        <w:t xml:space="preserve">La solución del problema consiste en aplicar la serie de transformaciones entre los sistemas de coordenadas definidos al aplicar la convención de </w:t>
-      </w:r>
-      <w:proofErr w:type="spellStart"/>
-      <w:r>
-        <w:rPr>
-          <w:lang w:val="es-ES"/>
-        </w:rPr>
-        <w:t>Denavit-Hartenberg</w:t>
-      </w:r>
-      <w:proofErr w:type="spellEnd"/>
-      <w:r>
-        <w:rPr>
-          <w:lang w:val="es-ES"/>
-        </w:rPr>
-        <w:t>. En la práctica de este trabajo final, dicho problema se resuelve mediante el método “</w:t>
-      </w:r>
-      <w:proofErr w:type="spellStart"/>
-      <w:r>
-        <w:rPr>
-          <w:lang w:val="es-ES"/>
-        </w:rPr>
-        <w:t>fkine</w:t>
-      </w:r>
-      <w:proofErr w:type="spellEnd"/>
-      <w:r>
-        <w:rPr>
-          <w:lang w:val="es-ES"/>
-        </w:rPr>
-        <w:t>” de la clase “</w:t>
-      </w:r>
-      <w:proofErr w:type="spellStart"/>
-      <w:r>
-        <w:rPr>
-          <w:lang w:val="es-ES"/>
-        </w:rPr>
-        <w:t>SerialLink</w:t>
-      </w:r>
-      <w:proofErr w:type="spellEnd"/>
-      <w:r>
-        <w:rPr>
-          <w:lang w:val="es-ES"/>
-        </w:rPr>
-        <w:t xml:space="preserve">” del </w:t>
-      </w:r>
-      <w:proofErr w:type="spellStart"/>
-      <w:r>
-        <w:rPr>
-          <w:lang w:val="es-ES"/>
-        </w:rPr>
-        <w:t>robotics</w:t>
-      </w:r>
-      <w:proofErr w:type="spellEnd"/>
-      <w:r>
-        <w:rPr>
-          <w:lang w:val="es-ES"/>
-        </w:rPr>
-        <w:t xml:space="preserve"> </w:t>
-      </w:r>
-      <w:proofErr w:type="spellStart"/>
-      <w:r>
-        <w:rPr>
-          <w:lang w:val="es-ES"/>
-        </w:rPr>
-        <w:t>Toolbox</w:t>
-      </w:r>
-      <w:proofErr w:type="spellEnd"/>
-      <w:r>
-        <w:rPr>
-          <w:lang w:val="es-ES"/>
-        </w:rPr>
-        <w:t xml:space="preserve"> de Peter </w:t>
-      </w:r>
-      <w:proofErr w:type="spellStart"/>
-      <w:r>
-        <w:rPr>
-          <w:lang w:val="es-ES"/>
-        </w:rPr>
-        <w:t>Corke</w:t>
-      </w:r>
-      <w:proofErr w:type="spellEnd"/>
-      <w:r>
-        <w:rPr>
-          <w:lang w:val="es-ES"/>
-        </w:rPr>
-        <w:t>.</w:t>
+        <w:t>(5</w:t>
+      </w:r>
+      <w:r>
+        <w:rPr>
+          <w:rFonts w:eastAsiaTheme="minorEastAsia"/>
+          <w:lang w:val="es-ES"/>
+        </w:rPr>
+        <w:t>)</w:t>
+      </w:r>
+    </w:p>
+    <w:p>
+      <w:pPr>
+        <w:rPr>
+          <w:lang w:val="es-ES"/>
+        </w:rPr>
+      </w:pPr>
+      <w:r>
+        <w:rPr>
+          <w:lang w:val="es-ES"/>
+        </w:rPr>
+        <w:t>La solución del problema consiste en aplicar la serie de transformaciones entre los sistemas de coordenadas definidos al aplicar la convención de Denavit-Hartenberg. En la práctica de este trabajo final, dicho problema se resuelve mediante el método “fkine” de la clase “SerialLink” del robotics Toolbox de Peter Corke.</w:t>
       </w:r>
       <w:bookmarkStart w:id="2" w:name="_Toc181286756"/>
     </w:p>
@@ -7274,12 +7029,6 @@
         <w:tab/>
       </w:r>
       <m:oMath>
-        <m:r>
-          <w:rPr>
-            <w:lang w:val="es-ES"/>
-          </w:rPr>
-          <w:tab/>
-        </m:r>
         <m:bar>
           <m:barPr>
             <m:pos m:val="top"/>
@@ -7356,21 +7105,7 @@
             <w:rFonts w:eastAsiaTheme="minorEastAsia"/>
             <w:lang w:val="es-ES"/>
           </w:rPr>
-          <m:t xml:space="preserve"> = f(</m:t>
-        </m:r>
-        <m:r>
-          <w:rPr>
-            <w:rFonts w:eastAsiaTheme="minorEastAsia"/>
-            <w:lang w:val="es-ES"/>
-          </w:rPr>
-          <m:t>x, y, z, α, β, γ</m:t>
-        </m:r>
-        <m:r>
-          <w:rPr>
-            <w:rFonts w:eastAsiaTheme="minorEastAsia"/>
-            <w:lang w:val="es-ES"/>
-          </w:rPr>
-          <m:t>)</m:t>
+          <m:t xml:space="preserve"> = f(x, y, z, α, β, γ)</m:t>
         </m:r>
       </m:oMath>
       <w:r>
@@ -7379,22 +7114,37 @@
           <w:lang w:val="es-ES"/>
         </w:rPr>
         <w:tab/>
-        <w:t>(5)</w:t>
-      </w:r>
-    </w:p>
-    <w:p>
-      <w:pPr>
+        <w:t>(6</w:t>
+      </w:r>
+      <w:r>
         <w:rPr>
           <w:rFonts w:eastAsiaTheme="minorEastAsia"/>
           <w:lang w:val="es-ES"/>
         </w:rPr>
-      </w:pPr>
-      <w:r>
+        <w:t>)</w:t>
+      </w:r>
+    </w:p>
+    <w:p>
+      <w:pPr>
         <w:rPr>
           <w:rFonts w:eastAsiaTheme="minorEastAsia"/>
           <w:lang w:val="es-ES"/>
         </w:rPr>
-        <w:t>Tomando como guía un trabajo realizado al respecto de la cinemática inversa de este tipo de robots [referencia], el problema se resuelve utilizando el método algebraico. Este método consiste en resolver el sistema de ecuaciones que se obtiene al igualar la matriz de transformación de la cinemática directa dada en forma paramétrica a partir de las variables articulares, con la matriz constante del problema:</w:t>
+      </w:pPr>
+      <w:r>
+        <w:rPr>
+          <w:rFonts w:eastAsiaTheme="minorEastAsia"/>
+          <w:lang w:val="es-ES"/>
+        </w:rPr>
+        <w:t xml:space="preserve">Tomando como guía un trabajo realizado al respecto de la cinemática inversa de este tipo de robots [referencia], el problema se resuelve utilizando el método algebraico. Este método </w:t>
+      </w:r>
+      <w:r>
+        <w:rPr>
+          <w:rFonts w:eastAsiaTheme="minorEastAsia"/>
+          <w:lang w:val="es-ES"/>
+        </w:rPr>
+        <w:lastRenderedPageBreak/>
+        <w:t>consiste en resolver el sistema de ecuaciones que se obtiene al igualar la matriz de transformación de la cinemática directa dada en forma paramétrica a partir de las variables articulares, con la matriz constante del problema:</w:t>
       </w:r>
     </w:p>
     <w:p>
@@ -7487,7 +7237,14 @@
           <w:lang w:val="es-ES"/>
         </w:rPr>
         <w:tab/>
-        <w:t>(6)</w:t>
+        <w:t>(7</w:t>
+      </w:r>
+      <w:r>
+        <w:rPr>
+          <w:rFonts w:eastAsiaTheme="minorEastAsia"/>
+          <w:lang w:val="es-ES"/>
+        </w:rPr>
+        <w:t>)</w:t>
       </w:r>
     </w:p>
     <w:p>
@@ -7600,7 +7357,14 @@
           <w:lang w:val="es-ES"/>
         </w:rPr>
         <w:tab/>
-        <w:t>(7)</w:t>
+        <w:t>(8</w:t>
+      </w:r>
+      <w:r>
+        <w:rPr>
+          <w:rFonts w:eastAsiaTheme="minorEastAsia"/>
+          <w:lang w:val="es-ES"/>
+        </w:rPr>
+        <w:t>)</w:t>
       </w:r>
     </w:p>
     <w:p>
@@ -7653,23 +7417,7 @@
           <w:lang w:val="es-ES"/>
         </w:rPr>
         <w:tab/>
-        <w:t>: es el objeto robot de la clase “</w:t>
-      </w:r>
-      <w:proofErr w:type="spellStart"/>
-      <w:r>
-        <w:rPr>
-          <w:rFonts w:eastAsiaTheme="minorEastAsia"/>
-          <w:lang w:val="es-ES"/>
-        </w:rPr>
-        <w:t>SerialLink</w:t>
-      </w:r>
-      <w:proofErr w:type="spellEnd"/>
-      <w:r>
-        <w:rPr>
-          <w:rFonts w:eastAsiaTheme="minorEastAsia"/>
-          <w:lang w:val="es-ES"/>
-        </w:rPr>
-        <w:t>”</w:t>
+        <w:t>: es el objeto robot de la clase “SerialLink”</w:t>
       </w:r>
     </w:p>
     <w:p>
@@ -8027,7 +7775,21 @@
           <w:rFonts w:eastAsiaTheme="minorEastAsia"/>
           <w:lang w:val="es-ES"/>
         </w:rPr>
-        <w:t>son todas las soluciones posibles ordenadas por fila.</w:t>
+        <w:t>son todas las soluciones posibles ordenadas por fila</w:t>
+      </w:r>
+      <w:r>
+        <w:rPr>
+          <w:rFonts w:eastAsiaTheme="minorEastAsia"/>
+          <w:lang w:val="es-ES"/>
+        </w:rPr>
+        <w:t>s</w:t>
+      </w:r>
+      <w:r>
+        <w:rPr>
+          <w:rFonts w:eastAsiaTheme="minorEastAsia"/>
+          <w:lang w:val="es-ES"/>
+        </w:rPr>
+        <w:t>.</w:t>
       </w:r>
     </w:p>
     <w:p>
@@ -8045,56 +7807,534 @@
           <w:rFonts w:eastAsiaTheme="minorEastAsia"/>
           <w:lang w:val="es-ES"/>
         </w:rPr>
-        <w:t xml:space="preserve">La solución del problema algebraico, arroja en sí 8 posibles soluciones para cada posición alcanzable. Sin embargo. </w:t>
-      </w:r>
-    </w:p>
-    <w:p>
-      <w:pPr>
-        <w:rPr>
-          <w:lang w:val="es-ES"/>
-        </w:rPr>
-      </w:pPr>
-      <w:r>
-        <w:rPr>
-          <w:lang w:val="es-ES"/>
-        </w:rPr>
-        <w:t xml:space="preserve">En </w:t>
-      </w:r>
-      <w:proofErr w:type="spellStart"/>
-      <w:r>
-        <w:rPr>
-          <w:lang w:val="es-ES"/>
-        </w:rPr>
-        <w:t>el</w:t>
-      </w:r>
-      <w:proofErr w:type="spellEnd"/>
-      <w:r>
-        <w:rPr>
-          <w:lang w:val="es-ES"/>
-        </w:rPr>
-        <w:t xml:space="preserve"> [anexo] se muestra la formulación extendida del problema por el método </w:t>
-      </w:r>
-      <w:bookmarkStart w:id="3" w:name="_GoBack"/>
-      <w:bookmarkEnd w:id="3"/>
-      <w:r>
-        <w:rPr>
-          <w:lang w:val="es-ES"/>
-        </w:rPr>
-        <w:t xml:space="preserve">algebraico junto con la síntesis de ecuaciones que permiten obtener los valores de las variables articulares y en </w:t>
-      </w:r>
-      <w:proofErr w:type="spellStart"/>
-      <w:r>
-        <w:rPr>
-          <w:lang w:val="es-ES"/>
-        </w:rPr>
-        <w:t>el</w:t>
-      </w:r>
-      <w:proofErr w:type="spellEnd"/>
-      <w:r>
-        <w:rPr>
-          <w:lang w:val="es-ES"/>
-        </w:rPr>
-        <w:t xml:space="preserve"> [anexo] la implementación en código.</w:t>
+        <w:t xml:space="preserve">El </w:t>
+      </w:r>
+      <w:r>
+        <w:rPr>
+          <w:rFonts w:eastAsiaTheme="minorEastAsia"/>
+          <w:lang w:val="es-ES"/>
+        </w:rPr>
+        <w:t>proble</w:t>
+      </w:r>
+      <w:r>
+        <w:rPr>
+          <w:rFonts w:eastAsiaTheme="minorEastAsia"/>
+          <w:lang w:val="es-ES"/>
+        </w:rPr>
+        <w:t>ma algebraico</w:t>
+      </w:r>
+      <w:r>
+        <w:rPr>
+          <w:rFonts w:eastAsiaTheme="minorEastAsia"/>
+          <w:lang w:val="es-ES"/>
+        </w:rPr>
+        <w:t xml:space="preserve"> arroja en sí 8 soluciones para cada </w:t>
+      </w:r>
+      <w:r>
+        <w:rPr>
+          <w:rFonts w:eastAsiaTheme="minorEastAsia"/>
+          <w:lang w:val="es-ES"/>
+        </w:rPr>
+        <w:t xml:space="preserve">postura alcanzable, en las que todas las variables </w:t>
+      </w:r>
+      <m:oMath>
+        <m:sSub>
+          <m:sSubPr>
+            <m:ctrlPr>
+              <w:rPr>
+                <w:rFonts w:eastAsiaTheme="minorEastAsia"/>
+                <w:i/>
+                <w:lang w:val="es-ES"/>
+              </w:rPr>
+            </m:ctrlPr>
+          </m:sSubPr>
+          <m:e>
+            <m:r>
+              <w:rPr>
+                <w:rFonts w:eastAsiaTheme="minorEastAsia"/>
+                <w:lang w:val="es-ES"/>
+              </w:rPr>
+              <m:t>θ</m:t>
+            </m:r>
+          </m:e>
+          <m:sub>
+            <m:r>
+              <w:rPr>
+                <w:rFonts w:eastAsiaTheme="minorEastAsia"/>
+                <w:lang w:val="es-ES"/>
+              </w:rPr>
+              <m:t>i</m:t>
+            </m:r>
+          </m:sub>
+        </m:sSub>
+      </m:oMath>
+      <w:r>
+        <w:rPr>
+          <w:rFonts w:eastAsiaTheme="minorEastAsia"/>
+          <w:lang w:val="es-ES"/>
+        </w:rPr>
+        <w:t xml:space="preserve"> toman valores en el intervalo </w:t>
+      </w:r>
+      <m:oMath>
+        <m:r>
+          <w:rPr>
+            <w:rFonts w:eastAsiaTheme="minorEastAsia"/>
+            <w:lang w:val="es-ES"/>
+          </w:rPr>
+          <m:t>[-2π, 2π]</m:t>
+        </m:r>
+      </m:oMath>
+      <w:r>
+        <w:rPr>
+          <w:rFonts w:eastAsiaTheme="minorEastAsia"/>
+          <w:lang w:val="es-ES"/>
+        </w:rPr>
+        <w:t xml:space="preserve">. </w:t>
+      </w:r>
+      <w:r>
+        <w:rPr>
+          <w:rFonts w:eastAsiaTheme="minorEastAsia"/>
+          <w:lang w:val="es-ES"/>
+        </w:rPr>
+        <w:t xml:space="preserve">Por cada una de estas </w:t>
+      </w:r>
+      <w:r>
+        <w:rPr>
+          <w:rFonts w:eastAsiaTheme="minorEastAsia"/>
+          <w:lang w:val="es-ES"/>
+        </w:rPr>
+        <w:t>soluciones</w:t>
+      </w:r>
+      <w:r>
+        <w:rPr>
+          <w:rFonts w:eastAsiaTheme="minorEastAsia"/>
+          <w:lang w:val="es-ES"/>
+        </w:rPr>
+        <w:t xml:space="preserve"> </w:t>
+      </w:r>
+      <m:oMath>
+        <m:bar>
+          <m:barPr>
+            <m:pos m:val="top"/>
+            <m:ctrlPr>
+              <w:rPr>
+                <w:rFonts w:eastAsiaTheme="minorEastAsia"/>
+                <w:i/>
+                <w:lang w:val="es-ES"/>
+              </w:rPr>
+            </m:ctrlPr>
+          </m:barPr>
+          <m:e>
+            <m:r>
+              <w:rPr>
+                <w:rFonts w:eastAsiaTheme="minorEastAsia"/>
+                <w:lang w:val="es-ES"/>
+              </w:rPr>
+              <m:t>θ</m:t>
+            </m:r>
+          </m:e>
+        </m:bar>
+      </m:oMath>
+      <w:r>
+        <w:rPr>
+          <w:rFonts w:eastAsiaTheme="minorEastAsia"/>
+          <w:lang w:val="es-ES"/>
+        </w:rPr>
+        <w:t xml:space="preserve">, supóngase que </w:t>
+      </w:r>
+      <w:r>
+        <w:rPr>
+          <w:rFonts w:eastAsiaTheme="minorEastAsia"/>
+          <w:lang w:val="es-ES"/>
+        </w:rPr>
+        <w:t>se genera</w:t>
+      </w:r>
+      <w:r>
+        <w:rPr>
+          <w:rFonts w:eastAsiaTheme="minorEastAsia"/>
+          <w:lang w:val="es-ES"/>
+        </w:rPr>
+        <w:t xml:space="preserve"> otra</w:t>
+      </w:r>
+      <w:r>
+        <w:rPr>
+          <w:rFonts w:eastAsiaTheme="minorEastAsia"/>
+          <w:lang w:val="es-ES"/>
+        </w:rPr>
+        <w:t xml:space="preserve"> </w:t>
+      </w:r>
+      <m:oMath>
+        <m:bar>
+          <m:barPr>
+            <m:pos m:val="top"/>
+            <m:ctrlPr>
+              <w:rPr>
+                <w:rFonts w:eastAsiaTheme="minorEastAsia"/>
+                <w:i/>
+                <w:lang w:val="es-ES"/>
+              </w:rPr>
+            </m:ctrlPr>
+          </m:barPr>
+          <m:e>
+            <m:r>
+              <w:rPr>
+                <w:rFonts w:eastAsiaTheme="minorEastAsia"/>
+                <w:lang w:val="es-ES"/>
+              </w:rPr>
+              <m:t>θ</m:t>
+            </m:r>
+          </m:e>
+        </m:bar>
+        <m:r>
+          <w:rPr>
+            <w:rFonts w:eastAsiaTheme="minorEastAsia"/>
+            <w:lang w:val="es-ES"/>
+          </w:rPr>
+          <m:t>'</m:t>
+        </m:r>
+      </m:oMath>
+      <w:r>
+        <w:rPr>
+          <w:rFonts w:eastAsiaTheme="minorEastAsia"/>
+          <w:lang w:val="es-ES"/>
+        </w:rPr>
+        <w:t xml:space="preserve"> en la que </w:t>
+      </w:r>
+      <m:oMath>
+        <m:sSub>
+          <m:sSubPr>
+            <m:ctrlPr>
+              <w:rPr>
+                <w:rFonts w:eastAsiaTheme="minorEastAsia"/>
+                <w:i/>
+                <w:lang w:val="es-ES"/>
+              </w:rPr>
+            </m:ctrlPr>
+          </m:sSubPr>
+          <m:e>
+            <m:r>
+              <w:rPr>
+                <w:rFonts w:eastAsiaTheme="minorEastAsia"/>
+                <w:lang w:val="es-ES"/>
+              </w:rPr>
+              <m:t>θ</m:t>
+            </m:r>
+          </m:e>
+          <m:sub>
+            <m:r>
+              <w:rPr>
+                <w:rFonts w:eastAsiaTheme="minorEastAsia"/>
+                <w:lang w:val="es-ES"/>
+              </w:rPr>
+              <m:t>1</m:t>
+            </m:r>
+          </m:sub>
+        </m:sSub>
+      </m:oMath>
+      <w:r>
+        <w:rPr>
+          <w:rFonts w:eastAsiaTheme="minorEastAsia"/>
+          <w:lang w:val="es-ES"/>
+        </w:rPr>
+        <w:t xml:space="preserve"> se cambia por </w:t>
+      </w:r>
+      <m:oMath>
+        <m:sSub>
+          <m:sSubPr>
+            <m:ctrlPr>
+              <w:rPr>
+                <w:rFonts w:eastAsiaTheme="minorEastAsia"/>
+                <w:i/>
+                <w:lang w:val="es-ES"/>
+              </w:rPr>
+            </m:ctrlPr>
+          </m:sSubPr>
+          <m:e>
+            <m:r>
+              <w:rPr>
+                <w:rFonts w:eastAsiaTheme="minorEastAsia"/>
+                <w:lang w:val="es-ES"/>
+              </w:rPr>
+              <m:t>θ</m:t>
+            </m:r>
+          </m:e>
+          <m:sub>
+            <m:r>
+              <w:rPr>
+                <w:rFonts w:eastAsiaTheme="minorEastAsia"/>
+                <w:lang w:val="es-ES"/>
+              </w:rPr>
+              <m:t>1</m:t>
+            </m:r>
+          </m:sub>
+        </m:sSub>
+        <m:r>
+          <w:rPr>
+            <w:rFonts w:eastAsiaTheme="minorEastAsia"/>
+            <w:lang w:val="es-ES"/>
+          </w:rPr>
+          <m:t>-</m:t>
+        </m:r>
+        <m:r>
+          <w:rPr>
+            <w:rFonts w:eastAsiaTheme="minorEastAsia"/>
+            <w:lang w:val="es-ES"/>
+          </w:rPr>
+          <m:t>2π</m:t>
+        </m:r>
+      </m:oMath>
+      <w:r>
+        <w:rPr>
+          <w:rFonts w:eastAsiaTheme="minorEastAsia"/>
+          <w:lang w:val="es-ES"/>
+        </w:rPr>
+        <w:t xml:space="preserve"> si </w:t>
+      </w:r>
+      <m:oMath>
+        <m:sSub>
+          <m:sSubPr>
+            <m:ctrlPr>
+              <w:rPr>
+                <w:rFonts w:eastAsiaTheme="minorEastAsia"/>
+                <w:i/>
+                <w:lang w:val="es-ES"/>
+              </w:rPr>
+            </m:ctrlPr>
+          </m:sSubPr>
+          <m:e>
+            <m:r>
+              <w:rPr>
+                <w:rFonts w:eastAsiaTheme="minorEastAsia"/>
+                <w:lang w:val="es-ES"/>
+              </w:rPr>
+              <m:t>θ</m:t>
+            </m:r>
+          </m:e>
+          <m:sub>
+            <m:r>
+              <w:rPr>
+                <w:rFonts w:eastAsiaTheme="minorEastAsia"/>
+                <w:lang w:val="es-ES"/>
+              </w:rPr>
+              <m:t>1</m:t>
+            </m:r>
+          </m:sub>
+        </m:sSub>
+        <m:r>
+          <w:rPr>
+            <w:rFonts w:eastAsiaTheme="minorEastAsia"/>
+            <w:lang w:val="es-ES"/>
+          </w:rPr>
+          <m:t>&gt;0</m:t>
+        </m:r>
+      </m:oMath>
+      <w:r>
+        <w:rPr>
+          <w:rFonts w:eastAsiaTheme="minorEastAsia"/>
+          <w:lang w:val="es-ES"/>
+        </w:rPr>
+        <w:t xml:space="preserve"> o por </w:t>
+      </w:r>
+      <m:oMath>
+        <m:sSub>
+          <m:sSubPr>
+            <m:ctrlPr>
+              <w:rPr>
+                <w:rFonts w:eastAsiaTheme="minorEastAsia"/>
+                <w:i/>
+                <w:lang w:val="es-ES"/>
+              </w:rPr>
+            </m:ctrlPr>
+          </m:sSubPr>
+          <m:e>
+            <m:r>
+              <w:rPr>
+                <w:rFonts w:eastAsiaTheme="minorEastAsia"/>
+                <w:lang w:val="es-ES"/>
+              </w:rPr>
+              <m:t>θ</m:t>
+            </m:r>
+          </m:e>
+          <m:sub>
+            <m:r>
+              <w:rPr>
+                <w:rFonts w:eastAsiaTheme="minorEastAsia"/>
+                <w:lang w:val="es-ES"/>
+              </w:rPr>
+              <m:t>1</m:t>
+            </m:r>
+          </m:sub>
+        </m:sSub>
+        <m:r>
+          <w:rPr>
+            <w:rFonts w:eastAsiaTheme="minorEastAsia"/>
+            <w:lang w:val="es-ES"/>
+          </w:rPr>
+          <m:t>+2π</m:t>
+        </m:r>
+      </m:oMath>
+      <w:r>
+        <w:rPr>
+          <w:rFonts w:eastAsiaTheme="minorEastAsia"/>
+          <w:lang w:val="es-ES"/>
+        </w:rPr>
+        <w:t xml:space="preserve"> si </w:t>
+      </w:r>
+      <m:oMath>
+        <m:sSub>
+          <m:sSubPr>
+            <m:ctrlPr>
+              <w:rPr>
+                <w:rFonts w:eastAsiaTheme="minorEastAsia"/>
+                <w:i/>
+                <w:lang w:val="es-ES"/>
+              </w:rPr>
+            </m:ctrlPr>
+          </m:sSubPr>
+          <m:e>
+            <m:r>
+              <w:rPr>
+                <w:rFonts w:eastAsiaTheme="minorEastAsia"/>
+                <w:lang w:val="es-ES"/>
+              </w:rPr>
+              <m:t>θ</m:t>
+            </m:r>
+          </m:e>
+          <m:sub>
+            <m:r>
+              <w:rPr>
+                <w:rFonts w:eastAsiaTheme="minorEastAsia"/>
+                <w:lang w:val="es-ES"/>
+              </w:rPr>
+              <m:t>1</m:t>
+            </m:r>
+          </m:sub>
+        </m:sSub>
+        <m:r>
+          <w:rPr>
+            <w:rFonts w:eastAsiaTheme="minorEastAsia"/>
+            <w:lang w:val="es-ES"/>
+          </w:rPr>
+          <m:t>&lt;0</m:t>
+        </m:r>
+      </m:oMath>
+      <w:r>
+        <w:rPr>
+          <w:rFonts w:eastAsiaTheme="minorEastAsia"/>
+          <w:lang w:val="es-ES"/>
+        </w:rPr>
+        <w:t xml:space="preserve">. Esa será también una solución válida porque da la misma postura en el extremo y está comprendida dentro del límite de la primera articulación. </w:t>
+      </w:r>
+      <w:r>
+        <w:rPr>
+          <w:rFonts w:eastAsiaTheme="minorEastAsia"/>
+          <w:lang w:val="es-ES"/>
+        </w:rPr>
+        <w:t xml:space="preserve">De esta manera, por cada componente del espacio articular, </w:t>
+      </w:r>
+      <w:r>
+        <w:rPr>
+          <w:rFonts w:eastAsiaTheme="minorEastAsia"/>
+          <w:lang w:val="es-ES"/>
+        </w:rPr>
+        <w:t>se pueden duplicar el número de soluciones</w:t>
+      </w:r>
+      <w:r>
+        <w:rPr>
+          <w:rFonts w:eastAsiaTheme="minorEastAsia"/>
+          <w:lang w:val="es-ES"/>
+        </w:rPr>
+        <w:t xml:space="preserve">, es decir, </w:t>
+      </w:r>
+      <w:r>
+        <w:rPr>
+          <w:rFonts w:eastAsiaTheme="minorEastAsia"/>
+          <w:lang w:val="es-ES"/>
+        </w:rPr>
+        <w:t xml:space="preserve">por </w:t>
+      </w:r>
+      <m:oMath>
+        <m:sSup>
+          <m:sSupPr>
+            <m:ctrlPr>
+              <w:rPr>
+                <w:rFonts w:eastAsiaTheme="minorEastAsia"/>
+                <w:i/>
+                <w:lang w:val="es-ES"/>
+              </w:rPr>
+            </m:ctrlPr>
+          </m:sSupPr>
+          <m:e>
+            <m:r>
+              <w:rPr>
+                <w:rFonts w:eastAsiaTheme="minorEastAsia"/>
+                <w:lang w:val="es-ES"/>
+              </w:rPr>
+              <m:t>2</m:t>
+            </m:r>
+          </m:e>
+          <m:sup>
+            <m:r>
+              <w:rPr>
+                <w:rFonts w:eastAsiaTheme="minorEastAsia"/>
+                <w:lang w:val="es-ES"/>
+              </w:rPr>
+              <m:t>6</m:t>
+            </m:r>
+          </m:sup>
+        </m:sSup>
+      </m:oMath>
+      <w:r>
+        <w:rPr>
+          <w:rFonts w:eastAsiaTheme="minorEastAsia"/>
+          <w:lang w:val="es-ES"/>
+        </w:rPr>
+        <w:t xml:space="preserve">, obteniéndose un total de </w:t>
+      </w:r>
+      <w:r>
+        <w:rPr>
+          <w:rFonts w:eastAsiaTheme="minorEastAsia"/>
+          <w:u w:val="single"/>
+          <w:lang w:val="es-ES"/>
+        </w:rPr>
+        <w:t>512 soluciones</w:t>
+      </w:r>
+      <w:r>
+        <w:rPr>
+          <w:rFonts w:eastAsiaTheme="minorEastAsia"/>
+          <w:lang w:val="es-ES"/>
+        </w:rPr>
+        <w:t xml:space="preserve">. Las soluciones </w:t>
+      </w:r>
+      <m:oMath>
+        <m:bar>
+          <m:barPr>
+            <m:pos m:val="top"/>
+            <m:ctrlPr>
+              <w:rPr>
+                <w:rFonts w:eastAsiaTheme="minorEastAsia"/>
+                <w:i/>
+                <w:lang w:val="es-ES"/>
+              </w:rPr>
+            </m:ctrlPr>
+          </m:barPr>
+          <m:e>
+            <m:r>
+              <w:rPr>
+                <w:rFonts w:eastAsiaTheme="minorEastAsia"/>
+                <w:lang w:val="es-ES"/>
+              </w:rPr>
+              <m:t>q</m:t>
+            </m:r>
+          </m:e>
+        </m:bar>
+      </m:oMath>
+      <w:r>
+        <w:rPr>
+          <w:rFonts w:eastAsiaTheme="minorEastAsia"/>
+          <w:lang w:val="es-ES"/>
+        </w:rPr>
+        <w:t xml:space="preserve"> se obtienen al aplicar los offset según (2).</w:t>
       </w:r>
     </w:p>
     <w:p>
@@ -8103,37 +8343,298 @@
           <w:tab w:val="left" w:pos="1418"/>
         </w:tabs>
         <w:rPr>
-          <w:lang w:val="es-ES"/>
-        </w:rPr>
-      </w:pPr>
-    </w:p>
-    <w:p>
-      <w:pPr>
-        <w:rPr>
-          <w:lang w:val="es-ES"/>
-        </w:rPr>
-      </w:pPr>
+          <w:rFonts w:eastAsiaTheme="minorEastAsia"/>
+          <w:lang w:val="es-ES"/>
+        </w:rPr>
+      </w:pPr>
+      <w:r>
+        <w:rPr>
+          <w:rFonts w:eastAsiaTheme="minorEastAsia"/>
+          <w:lang w:val="es-ES"/>
+        </w:rPr>
+        <w:t xml:space="preserve">Para </w:t>
+      </w:r>
+      <w:r>
+        <w:rPr>
+          <w:rFonts w:eastAsiaTheme="minorEastAsia"/>
+          <w:u w:val="single"/>
+          <w:lang w:val="es-ES"/>
+        </w:rPr>
+        <w:t>validar</w:t>
+      </w:r>
+      <w:r>
+        <w:rPr>
+          <w:rFonts w:eastAsiaTheme="minorEastAsia"/>
+          <w:lang w:val="es-ES"/>
+        </w:rPr>
+        <w:t xml:space="preserve"> la función de cinemática inversa, se realiza el siguiente procedimiento.</w:t>
+      </w:r>
+    </w:p>
+    <w:p>
+      <w:pPr>
+        <w:pStyle w:val="Prrafodelista"/>
+        <w:numPr>
+          <w:ilvl w:val="0"/>
+          <w:numId w:val="5"/>
+        </w:numPr>
+        <w:tabs>
+          <w:tab w:val="left" w:pos="1418"/>
+        </w:tabs>
+        <w:rPr>
+          <w:rFonts w:eastAsiaTheme="minorEastAsia"/>
+          <w:lang w:val="es-ES"/>
+        </w:rPr>
+      </w:pPr>
+      <w:r>
+        <w:rPr>
+          <w:rFonts w:eastAsiaTheme="minorEastAsia"/>
+          <w:lang w:val="es-ES"/>
+        </w:rPr>
+        <w:t xml:space="preserve">Para </w:t>
+      </w:r>
+      <m:oMath>
+        <m:r>
+          <w:rPr>
+            <w:rFonts w:eastAsiaTheme="minorEastAsia"/>
+            <w:lang w:val="es-ES"/>
+          </w:rPr>
+          <m:t>q=[0 0 0 0 0 0]</m:t>
+        </m:r>
+      </m:oMath>
+      <w:r>
+        <w:rPr>
+          <w:rFonts w:eastAsiaTheme="minorEastAsia"/>
+          <w:lang w:val="es-ES"/>
+        </w:rPr>
+        <w:t xml:space="preserve">, se calcula T con </w:t>
+      </w:r>
+      <m:oMath>
+        <m:r>
+          <w:rPr>
+            <w:rFonts w:eastAsiaTheme="minorEastAsia"/>
+            <w:lang w:val="es-ES"/>
+          </w:rPr>
+          <m:t>R.fkine</m:t>
+        </m:r>
+        <m:r>
+          <w:rPr>
+            <w:rFonts w:eastAsiaTheme="minorEastAsia"/>
+            <w:lang w:val="es-ES"/>
+          </w:rPr>
+          <m:t>(q)</m:t>
+        </m:r>
+        <m:r>
+          <w:rPr>
+            <w:rFonts w:eastAsiaTheme="minorEastAsia"/>
+            <w:lang w:val="es-ES"/>
+          </w:rPr>
+          <m:t>.</m:t>
+        </m:r>
+      </m:oMath>
+    </w:p>
+    <w:p>
+      <w:pPr>
+        <w:pStyle w:val="Prrafodelista"/>
+        <w:numPr>
+          <w:ilvl w:val="0"/>
+          <w:numId w:val="5"/>
+        </w:numPr>
+        <w:tabs>
+          <w:tab w:val="left" w:pos="1418"/>
+        </w:tabs>
+        <w:rPr>
+          <w:rFonts w:eastAsiaTheme="minorEastAsia"/>
+          <w:lang w:val="es-ES"/>
+        </w:rPr>
+      </w:pPr>
+      <w:r>
+        <w:rPr>
+          <w:rFonts w:eastAsiaTheme="minorEastAsia"/>
+          <w:lang w:val="es-ES"/>
+        </w:rPr>
+        <w:t xml:space="preserve">Se obtiene </w:t>
+      </w:r>
+      <m:oMath>
+        <m:r>
+          <w:rPr>
+            <w:rFonts w:eastAsiaTheme="minorEastAsia"/>
+            <w:lang w:val="es-ES"/>
+          </w:rPr>
+          <m:t>Q</m:t>
+        </m:r>
+      </m:oMath>
+      <w:r>
+        <w:rPr>
+          <w:rFonts w:eastAsiaTheme="minorEastAsia"/>
+          <w:lang w:val="es-ES"/>
+        </w:rPr>
+        <w:t xml:space="preserve"> según (8) para la T obtenida con </w:t>
+      </w:r>
+      <m:oMath>
+        <m:sSub>
+          <m:sSubPr>
+            <m:ctrlPr>
+              <w:rPr>
+                <w:rFonts w:eastAsiaTheme="minorEastAsia"/>
+                <w:i/>
+                <w:lang w:val="es-ES"/>
+              </w:rPr>
+            </m:ctrlPr>
+          </m:sSubPr>
+          <m:e>
+            <m:r>
+              <w:rPr>
+                <w:rFonts w:eastAsiaTheme="minorEastAsia"/>
+                <w:lang w:val="es-ES"/>
+              </w:rPr>
+              <m:t>q</m:t>
+            </m:r>
+          </m:e>
+          <m:sub>
+            <m:r>
+              <w:rPr>
+                <w:rFonts w:eastAsiaTheme="minorEastAsia"/>
+                <w:lang w:val="es-ES"/>
+              </w:rPr>
+              <m:t>mejor</m:t>
+            </m:r>
+          </m:sub>
+        </m:sSub>
+        <m:r>
+          <w:rPr>
+            <w:rFonts w:eastAsiaTheme="minorEastAsia"/>
+            <w:lang w:val="es-ES"/>
+          </w:rPr>
+          <m:t>=false</m:t>
+        </m:r>
+      </m:oMath>
+      <w:r>
+        <w:rPr>
+          <w:rFonts w:eastAsiaTheme="minorEastAsia"/>
+          <w:lang w:val="es-ES"/>
+        </w:rPr>
+        <w:t>.</w:t>
+      </w:r>
+    </w:p>
+    <w:p>
+      <w:pPr>
+        <w:pStyle w:val="Prrafodelista"/>
+        <w:numPr>
+          <w:ilvl w:val="0"/>
+          <w:numId w:val="5"/>
+        </w:numPr>
+        <w:tabs>
+          <w:tab w:val="left" w:pos="1418"/>
+        </w:tabs>
+        <w:rPr>
+          <w:rFonts w:eastAsiaTheme="minorEastAsia"/>
+          <w:lang w:val="es-ES"/>
+        </w:rPr>
+      </w:pPr>
+      <w:r>
+        <w:rPr>
+          <w:rFonts w:eastAsiaTheme="minorEastAsia"/>
+          <w:lang w:val="es-ES"/>
+        </w:rPr>
+        <w:t xml:space="preserve">Se hace </w:t>
+      </w:r>
+      <m:oMath>
+        <m:r>
+          <w:rPr>
+            <w:rFonts w:eastAsiaTheme="minorEastAsia"/>
+            <w:lang w:val="es-ES"/>
+          </w:rPr>
+          <m:t>R.fkine(Q)</m:t>
+        </m:r>
+      </m:oMath>
+      <w:r>
+        <w:rPr>
+          <w:rFonts w:eastAsiaTheme="minorEastAsia"/>
+          <w:lang w:val="es-ES"/>
+        </w:rPr>
+        <w:t>.</w:t>
+      </w:r>
+    </w:p>
+    <w:p>
+      <w:pPr>
+        <w:tabs>
+          <w:tab w:val="left" w:pos="1418"/>
+        </w:tabs>
+        <w:ind w:left="360" w:firstLine="0"/>
+        <w:rPr>
+          <w:rFonts w:eastAsiaTheme="minorEastAsia"/>
+          <w:lang w:val="es-ES"/>
+        </w:rPr>
+      </w:pPr>
+      <w:r>
+        <w:rPr>
+          <w:rFonts w:eastAsiaTheme="minorEastAsia"/>
+          <w:lang w:val="es-ES"/>
+        </w:rPr>
+        <w:t>Para todas las soluciones debería obtenerse la misma matriz T como solución.</w:t>
+      </w:r>
+    </w:p>
+    <w:p>
+      <w:pPr>
+        <w:rPr>
+          <w:lang w:val="es-ES"/>
+        </w:rPr>
+      </w:pPr>
+      <w:r>
+        <w:rPr>
+          <w:lang w:val="es-ES"/>
+        </w:rPr>
+        <w:t>En el [anexo] se muestra la formulación extendida del problema por el método algebraico junto con la síntesis de ecuaciones y en el [anexo] la implementación en código.</w:t>
+      </w:r>
+    </w:p>
+    <w:p>
+      <w:pPr>
+        <w:pStyle w:val="Ttulo1"/>
+        <w:rPr>
+          <w:lang w:val="es-ES"/>
+        </w:rPr>
+      </w:pPr>
+      <w:r>
+        <w:rPr>
+          <w:lang w:val="es-ES"/>
+        </w:rPr>
+        <w:t>7.</w:t>
+      </w:r>
+      <w:r>
+        <w:rPr>
+          <w:lang w:val="es-ES"/>
+        </w:rPr>
+        <w:tab/>
+        <w:t>Relación de Velocidades</w:t>
+      </w:r>
+    </w:p>
+    <w:p>
+      <w:pPr>
+        <w:rPr>
+          <w:lang w:val="es-ES"/>
+        </w:rPr>
+      </w:pPr>
+      <w:bookmarkStart w:id="3" w:name="_GoBack"/>
+      <w:bookmarkEnd w:id="3"/>
+    </w:p>
+    <w:p>
+      <w:pPr>
+        <w:pStyle w:val="Ttulo1"/>
+        <w:ind w:firstLine="0"/>
+        <w:rPr>
+          <w:lang w:val="es-ES"/>
+        </w:rPr>
+      </w:pPr>
+      <w:bookmarkStart w:id="4" w:name="_Toc181286759"/>
+      <w:bookmarkEnd w:id="2"/>
       <w:r>
         <w:rPr>
           <w:lang w:val="es-ES"/>
         </w:rPr>
         <w:lastRenderedPageBreak/>
-        <w:t xml:space="preserve">Cuando la posición es alcanzable </w:t>
-      </w:r>
-    </w:p>
-    <w:p>
-      <w:pPr>
-        <w:rPr>
-          <w:lang w:val="es-ES"/>
-        </w:rPr>
-      </w:pPr>
-      <w:r>
-        <w:rPr>
-          <w:lang w:val="es-ES"/>
-        </w:rPr>
-        <w:t>Relación de Velocidades y Puntos Singulares</w:t>
-      </w:r>
-      <w:bookmarkEnd w:id="2"/>
+        <w:t>Planificación y Generación de Trayectorias</w:t>
+      </w:r>
+      <w:bookmarkEnd w:id="4"/>
     </w:p>
     <w:p>
       <w:pPr>
@@ -8142,30 +8643,14 @@
           <w:lang w:val="es-ES"/>
         </w:rPr>
       </w:pPr>
-      <w:bookmarkStart w:id="4" w:name="_Toc181286757"/>
-      <w:proofErr w:type="spellStart"/>
-      <w:r>
-        <w:rPr>
-          <w:lang w:val="es-ES"/>
-        </w:rPr>
-        <w:t>Jacobiano</w:t>
-      </w:r>
-      <w:proofErr w:type="spellEnd"/>
-      <w:r>
-        <w:rPr>
-          <w:lang w:val="es-ES"/>
-        </w:rPr>
-        <w:t xml:space="preserve"> y determinante </w:t>
-      </w:r>
-      <w:proofErr w:type="spellStart"/>
-      <w:r>
-        <w:rPr>
-          <w:lang w:val="es-ES"/>
-        </w:rPr>
-        <w:t>jacobiano</w:t>
-      </w:r>
-      <w:bookmarkEnd w:id="4"/>
-      <w:proofErr w:type="spellEnd"/>
+      <w:bookmarkStart w:id="5" w:name="_Toc181286760"/>
+      <w:r>
+        <w:rPr>
+          <w:lang w:val="es-ES"/>
+        </w:rPr>
+        <w:t>Planificación</w:t>
+      </w:r>
+      <w:bookmarkEnd w:id="5"/>
     </w:p>
     <w:p>
       <w:pPr>
@@ -8174,14 +8659,14 @@
           <w:lang w:val="es-ES"/>
         </w:rPr>
       </w:pPr>
-      <w:bookmarkStart w:id="5" w:name="_Toc181286758"/>
-      <w:r>
-        <w:rPr>
-          <w:lang w:val="es-ES"/>
-        </w:rPr>
-        <w:t>Puntos singulares</w:t>
-      </w:r>
-      <w:bookmarkEnd w:id="5"/>
+      <w:bookmarkStart w:id="6" w:name="_Toc181286761"/>
+      <w:r>
+        <w:rPr>
+          <w:lang w:val="es-ES"/>
+        </w:rPr>
+        <w:t>Generación de trayectorias</w:t>
+      </w:r>
+      <w:bookmarkEnd w:id="6"/>
     </w:p>
     <w:p>
       <w:pPr>
@@ -8190,14 +8675,46 @@
           <w:lang w:val="es-ES"/>
         </w:rPr>
       </w:pPr>
-      <w:bookmarkStart w:id="6" w:name="_Toc181286759"/>
-      <w:r>
-        <w:rPr>
-          <w:lang w:val="es-ES"/>
-        </w:rPr>
-        <w:t>Planificación y Generación de Trayectorias</w:t>
-      </w:r>
-      <w:bookmarkEnd w:id="6"/>
+      <w:bookmarkStart w:id="7" w:name="_Toc181286762"/>
+      <w:r>
+        <w:rPr>
+          <w:lang w:val="es-ES"/>
+        </w:rPr>
+        <w:t>Conclusión</w:t>
+      </w:r>
+      <w:bookmarkEnd w:id="7"/>
+    </w:p>
+    <w:p>
+      <w:pPr>
+        <w:pStyle w:val="Ttulo1"/>
+        <w:rPr>
+          <w:lang w:val="es-ES"/>
+        </w:rPr>
+      </w:pPr>
+      <w:bookmarkStart w:id="8" w:name="_Toc181286763"/>
+      <w:r>
+        <w:rPr>
+          <w:lang w:val="es-ES"/>
+        </w:rPr>
+        <w:t>Referencias</w:t>
+      </w:r>
+      <w:bookmarkEnd w:id="8"/>
+    </w:p>
+    <w:p>
+      <w:pPr>
+        <w:pStyle w:val="Ttulo1"/>
+        <w:rPr>
+          <w:lang w:val="es-ES"/>
+        </w:rPr>
+      </w:pPr>
+      <w:bookmarkStart w:id="9" w:name="_Toc181286764"/>
+      <w:r>
+        <w:rPr>
+          <w:lang w:val="es-ES"/>
+        </w:rPr>
+        <w:t>Anexos</w:t>
+      </w:r>
+      <w:bookmarkEnd w:id="9"/>
     </w:p>
     <w:p>
       <w:pPr>
@@ -8206,14 +8723,14 @@
           <w:lang w:val="es-ES"/>
         </w:rPr>
       </w:pPr>
-      <w:bookmarkStart w:id="7" w:name="_Toc181286760"/>
-      <w:r>
-        <w:rPr>
-          <w:lang w:val="es-ES"/>
-        </w:rPr>
-        <w:t>Planificación</w:t>
-      </w:r>
-      <w:bookmarkEnd w:id="7"/>
+      <w:bookmarkStart w:id="10" w:name="_Toc181286765"/>
+      <w:r>
+        <w:rPr>
+          <w:lang w:val="es-ES"/>
+        </w:rPr>
+        <w:t>Definición del Robot</w:t>
+      </w:r>
+      <w:bookmarkEnd w:id="10"/>
     </w:p>
     <w:p>
       <w:pPr>
@@ -8222,60 +8739,12 @@
           <w:lang w:val="es-ES"/>
         </w:rPr>
       </w:pPr>
-      <w:bookmarkStart w:id="8" w:name="_Toc181286761"/>
-      <w:r>
-        <w:rPr>
-          <w:lang w:val="es-ES"/>
-        </w:rPr>
-        <w:t>Generación de trayectorias</w:t>
-      </w:r>
-      <w:bookmarkEnd w:id="8"/>
-    </w:p>
-    <w:p>
-      <w:pPr>
-        <w:pStyle w:val="Ttulo1"/>
-        <w:rPr>
-          <w:lang w:val="es-ES"/>
-        </w:rPr>
-      </w:pPr>
-      <w:bookmarkStart w:id="9" w:name="_Toc181286762"/>
-      <w:r>
-        <w:rPr>
-          <w:lang w:val="es-ES"/>
-        </w:rPr>
-        <w:t>Conclusión</w:t>
-      </w:r>
-      <w:bookmarkEnd w:id="9"/>
-    </w:p>
-    <w:p>
-      <w:pPr>
-        <w:pStyle w:val="Ttulo1"/>
-        <w:rPr>
-          <w:lang w:val="es-ES"/>
-        </w:rPr>
-      </w:pPr>
-      <w:bookmarkStart w:id="10" w:name="_Toc181286763"/>
-      <w:r>
-        <w:rPr>
-          <w:lang w:val="es-ES"/>
-        </w:rPr>
-        <w:t>Referencias</w:t>
-      </w:r>
-      <w:bookmarkEnd w:id="10"/>
-    </w:p>
-    <w:p>
-      <w:pPr>
-        <w:pStyle w:val="Ttulo1"/>
-        <w:rPr>
-          <w:lang w:val="es-ES"/>
-        </w:rPr>
-      </w:pPr>
-      <w:bookmarkStart w:id="11" w:name="_Toc181286764"/>
-      <w:r>
-        <w:rPr>
-          <w:lang w:val="es-ES"/>
-        </w:rPr>
-        <w:t>Anexos</w:t>
+      <w:bookmarkStart w:id="11" w:name="_Toc181286766"/>
+      <w:r>
+        <w:rPr>
+          <w:lang w:val="es-ES"/>
+        </w:rPr>
+        <w:t>Función de Cinemática Inversa</w:t>
       </w:r>
       <w:bookmarkEnd w:id="11"/>
     </w:p>
@@ -8286,46 +8755,14 @@
           <w:lang w:val="es-ES"/>
         </w:rPr>
       </w:pPr>
-      <w:bookmarkStart w:id="12" w:name="_Toc181286765"/>
-      <w:r>
-        <w:rPr>
-          <w:lang w:val="es-ES"/>
-        </w:rPr>
-        <w:t>Definición del Robot</w:t>
+      <w:bookmarkStart w:id="12" w:name="_Toc181286767"/>
+      <w:r>
+        <w:rPr>
+          <w:lang w:val="es-ES"/>
+        </w:rPr>
+        <w:t>Funciones de Generación de Trayectorias</w:t>
       </w:r>
       <w:bookmarkEnd w:id="12"/>
-    </w:p>
-    <w:p>
-      <w:pPr>
-        <w:pStyle w:val="Ttulo2"/>
-        <w:rPr>
-          <w:lang w:val="es-ES"/>
-        </w:rPr>
-      </w:pPr>
-      <w:bookmarkStart w:id="13" w:name="_Toc181286766"/>
-      <w:r>
-        <w:rPr>
-          <w:lang w:val="es-ES"/>
-        </w:rPr>
-        <w:t>Función de Cinemática Inversa</w:t>
-      </w:r>
-      <w:bookmarkEnd w:id="13"/>
-    </w:p>
-    <w:p>
-      <w:pPr>
-        <w:pStyle w:val="Ttulo2"/>
-        <w:rPr>
-          <w:lang w:val="es-ES"/>
-        </w:rPr>
-      </w:pPr>
-      <w:bookmarkStart w:id="14" w:name="_Toc181286767"/>
-      <w:r>
-        <w:rPr>
-          <w:lang w:val="es-ES"/>
-        </w:rPr>
-        <w:t>Funciones de Generación de Trayectorias</w:t>
-      </w:r>
-      <w:bookmarkEnd w:id="14"/>
     </w:p>
     <w:p>
       <w:pPr>
@@ -8376,15 +8813,6 @@
 
 <file path=word/footer1.xml><?xml version="1.0" encoding="utf-8"?>
 <w:ftr xmlns:wpc="http://schemas.microsoft.com/office/word/2010/wordprocessingCanvas" xmlns:mc="http://schemas.openxmlformats.org/markup-compatibility/2006" xmlns:o="urn:schemas-microsoft-com:office:office" xmlns:r="http://schemas.openxmlformats.org/officeDocument/2006/relationships" xmlns:m="http://schemas.openxmlformats.org/officeDocument/2006/math" xmlns:v="urn:schemas-microsoft-com:vml" xmlns:wp14="http://schemas.microsoft.com/office/word/2010/wordprocessingDrawing" xmlns:wp="http://schemas.openxmlformats.org/drawingml/2006/wordprocessingDrawing" xmlns:w10="urn:schemas-microsoft-com:office:word" xmlns:w="http://schemas.openxmlformats.org/wordprocessingml/2006/main" xmlns:w14="http://schemas.microsoft.com/office/word/2010/wordml" xmlns:w15="http://schemas.microsoft.com/office/word/2012/wordml" xmlns:wpg="http://schemas.microsoft.com/office/word/2010/wordprocessingGroup" xmlns:wpi="http://schemas.microsoft.com/office/word/2010/wordprocessingInk" xmlns:wne="http://schemas.microsoft.com/office/word/2006/wordml" xmlns:wps="http://schemas.microsoft.com/office/word/2010/wordprocessingShape" mc:Ignorable="w14 w15 wp14">
-  <w:p>
-    <w:pPr>
-      <w:pStyle w:val="Encabezado"/>
-      <w:rPr>
-        <w:b/>
-        <w:lang w:val="es-ES"/>
-      </w:rPr>
-    </w:pPr>
-  </w:p>
   <w:p>
     <w:pPr>
       <w:pStyle w:val="Encabezado"/>
@@ -9957,6 +10385,7 @@
   <w:style w:type="character" w:default="1" w:styleId="Fuentedeprrafopredeter">
     <w:name w:val="Default Paragraph Font"/>
     <w:uiPriority w:val="1"/>
+    <w:semiHidden/>
     <w:unhideWhenUsed/>
   </w:style>
   <w:style w:type="table" w:default="1" w:styleId="Tablanormal">
@@ -10314,6 +10743,7 @@
   <w:rsids>
     <w:rsidRoot w:val="00903B28"/>
     <w:rsid w:val="00903B28"/>
+    <w:rsid w:val="00D702A4"/>
   </w:rsids>
   <m:mathPr>
     <m:mathFont m:val="Cambria Math"/>
@@ -10762,7 +11192,7 @@
     <w:basedOn w:val="Fuentedeprrafopredeter"/>
     <w:uiPriority w:val="99"/>
     <w:semiHidden/>
-    <w:rsid w:val="00903B28"/>
+    <w:rsid w:val="00D702A4"/>
     <w:rPr>
       <w:color w:val="808080"/>
     </w:rPr>
@@ -11043,7 +11473,7 @@
 </file>
 
 <file path=customXml/itemProps1.xml><?xml version="1.0" encoding="utf-8"?>
-<ds:datastoreItem xmlns:ds="http://schemas.openxmlformats.org/officeDocument/2006/customXml" ds:itemID="{C5CF2757-E4DE-4C24-9893-BB5963E2F982}">
+<ds:datastoreItem xmlns:ds="http://schemas.openxmlformats.org/officeDocument/2006/customXml" ds:itemID="{B2097D8C-B909-4D07-9E1A-A3836E1E8255}">
   <ds:schemaRefs>
     <ds:schemaRef ds:uri="http://schemas.openxmlformats.org/officeDocument/2006/bibliography"/>
   </ds:schemaRefs>

</xml_diff>